<commit_message>
Add 打印打印 watermarks and direct PDF/Word downloads
</commit_message>
<xml_diff>
--- a/paper/论文阅读版.docx
+++ b/paper/论文阅读版.docx
@@ -21656,7 +21656,43 @@
   <w:p>
     <w:pPr>
       <w:pStyle w:val="Header"/>
+      <w:spacing w:before="0" w:after="0" w:line="20" w:lineRule="exact"/>
     </w:pPr>
+    <w:r>
+      <w:rPr>
+        <w:noProof/>
+      </w:rPr>
+      <w:pict>
+        <v:shapetype id="_x0000_t136" coordsize="21600,21600" o:spt="136" adj="10800" path="m@7,l@8,m@5,21600l@6,21600e">
+          <v:formulas>
+            <v:f eqn="sum #0 0 10800"/>
+            <v:f eqn="prod #0 2 1"/>
+            <v:f eqn="sum 21600 0 @1"/>
+            <v:f eqn="sum 0 0 @2"/>
+            <v:f eqn="sum 21600 0 @3"/>
+            <v:f eqn="if @0 @3 0"/>
+            <v:f eqn="if @0 21600 @1"/>
+            <v:f eqn="if @0 0 @2"/>
+            <v:f eqn="if @0 @4 21600"/>
+            <v:f eqn="mid @5 @6"/>
+            <v:f eqn="mid @8 @5"/>
+            <v:f eqn="mid @7 @8"/>
+            <v:f eqn="mid @6 @7"/>
+          </v:formulas>
+          <v:path textpathok="t" o:connecttype="custom" o:connectlocs="@9,0;@10,10800;@11,21600;@12,10800" o:connectangles="270,180,90,0"/>
+          <v:textpath on="t" fitshape="t"/>
+          <v:handles>
+            <v:h position="#0,bottomRight" xrange="6629,14971"/>
+          </v:handles>
+          <o:lock v:ext="edit" text="t" shapetype="t"/>
+        </v:shapetype>
+        <v:shape id="PowerPlusWaterMarkObjectPrintPrint" o:spid="_x0000_s2049" type="#_x0000_t136" fillcolor="#A0A0A0" stroked="f" o:allowincell="f" style="position:absolute;margin-left:0;margin-top:0;width:320pt;height:80pt;rotation:315;z-index:-251656192;mso-position-horizontal:center;mso-position-horizontal-relative:page;mso-position-vertical:center;mso-position-vertical-relative:page">
+          <v:fill opacity="0.20"/>
+          <v:textpath style="font-family:&quot;Songti SC&quot;;font-size:1pt" string="打印打印"/>
+          <w10:wrap type="none" anchorx="page" anchory="page"/>
+        </v:shape>
+      </w:pict>
+    </w:r>
   </w:p>
 </w:hdr>
 </file>

</xml_diff>

<commit_message>
Restore unwatermarked papers and link author to X
</commit_message>
<xml_diff>
--- a/paper/论文阅读版.docx
+++ b/paper/论文阅读版.docx
@@ -21656,43 +21656,7 @@
   <w:p>
     <w:pPr>
       <w:pStyle w:val="Header"/>
-      <w:spacing w:before="0" w:after="0" w:line="20" w:lineRule="exact"/>
     </w:pPr>
-    <w:r>
-      <w:rPr>
-        <w:noProof/>
-      </w:rPr>
-      <w:pict>
-        <v:shapetype id="_x0000_t136" coordsize="21600,21600" o:spt="136" adj="10800" path="m@7,l@8,m@5,21600l@6,21600e">
-          <v:formulas>
-            <v:f eqn="sum #0 0 10800"/>
-            <v:f eqn="prod #0 2 1"/>
-            <v:f eqn="sum 21600 0 @1"/>
-            <v:f eqn="sum 0 0 @2"/>
-            <v:f eqn="sum 21600 0 @3"/>
-            <v:f eqn="if @0 @3 0"/>
-            <v:f eqn="if @0 21600 @1"/>
-            <v:f eqn="if @0 0 @2"/>
-            <v:f eqn="if @0 @4 21600"/>
-            <v:f eqn="mid @5 @6"/>
-            <v:f eqn="mid @8 @5"/>
-            <v:f eqn="mid @7 @8"/>
-            <v:f eqn="mid @6 @7"/>
-          </v:formulas>
-          <v:path textpathok="t" o:connecttype="custom" o:connectlocs="@9,0;@10,10800;@11,21600;@12,10800" o:connectangles="270,180,90,0"/>
-          <v:textpath on="t" fitshape="t"/>
-          <v:handles>
-            <v:h position="#0,bottomRight" xrange="6629,14971"/>
-          </v:handles>
-          <o:lock v:ext="edit" text="t" shapetype="t"/>
-        </v:shapetype>
-        <v:shape id="PowerPlusWaterMarkObjectPrintPrint" o:spid="_x0000_s2049" type="#_x0000_t136" fillcolor="#A0A0A0" stroked="f" o:allowincell="f" style="position:absolute;margin-left:0;margin-top:0;width:320pt;height:80pt;rotation:315;z-index:-251656192;mso-position-horizontal:center;mso-position-horizontal-relative:page;mso-position-vertical:center;mso-position-vertical-relative:page">
-          <v:fill opacity="0.20"/>
-          <v:textpath style="font-family:&quot;Songti SC&quot;;font-size:1pt" string="打印打印"/>
-          <w10:wrap type="none" anchorx="page" anchory="page"/>
-        </v:shape>
-      </w:pict>
-    </w:r>
   </w:p>
 </w:hdr>
 </file>

</xml_diff>